<commit_message>
Alvará evento 30/10: pedido ao Município no modelo de ofício, ao secretário responsável
Co-Authored-By: Claude Opus 5.5 <noreply@anthropic.com>
Claude-Session: https://claude.ai/code/session_01Xsu4psjqdzYnCKVsDP2B5y
</commit_message>
<xml_diff>
--- a/Alvará evento 30-10-2026 - Ronaldo de Lima Barbosa/Pedido de interdição ao Município - evento 30-10-2026.docx
+++ b/Alvará evento 30-10-2026 - Ronaldo de Lima Barbosa/Pedido de interdição ao Município - evento 30-10-2026.docx
@@ -12,24 +12,7 @@
           <w:b/>
           <w:bCs/>
         </w:rPr>
-        <w:t xml:space="preserve">AO(À) SENHOR(A) SECRETÁRIO(A) MUNICIPAL DE </w:t>
-      </w:r>
-      <w:r>
-        <w:rPr>
-          <w:b/>
-          <w:bCs/>
-          <w:b/>
-          <w:bCs/>
-          <w:shd w:fill="FFF200" w:color="auto" w:val="clear"/>
-        </w:rPr>
-        <w:t xml:space="preserve">[____]</w:t>
-      </w:r>
-      <w:r>
-        <w:rPr>
-          <w:b/>
-          <w:bCs/>
-        </w:rPr>
-        <w:t xml:space="preserve"> DE MIGUEL ALVES-PI.</w:t>
+        <w:t xml:space="preserve">AO(À) SENHOR(A) SECRETÁRIO(A) RESPONSÁVEL DO MUNICÍPIO DE MIGUEL ALVES-PI.</w:t>
       </w:r>
     </w:p>
     <w:p>
@@ -48,7 +31,10 @@
           <w:b/>
           <w:bCs/>
         </w:rPr>
-        <w:t xml:space="preserve">URGENTE – INTERDIÇÃO A PARTIR DE 30/10/2026.</w:t>
+        <w:t xml:space="preserve">Assunto:</w:t>
+      </w:r>
+      <w:r>
+        <w:t xml:space="preserve"> pedido de interdição temporária de via e de autorização de carreata – 30/10/2026.</w:t>
       </w:r>
     </w:p>
     <w:p>
@@ -80,48 +66,40 @@
         <w:t xml:space="preserve">ANTÔNIO DE PÁDUA SANTOS NETO</w:t>
       </w:r>
       <w:r>
-        <w:t xml:space="preserve">, inscrito na OAB-PI sob o nº 21.320, constituído mediante procuração em anexo, com endereço físico na Rua Rio Grande do Sul, nº 1641, Bairro São Miguel, Miguel Alves-PI, CEP 64.130-000, e eletrônico paduanetojus@gmail.com, vem, respeitosamente, requerer </w:t>
-      </w:r>
-      <w:r>
-        <w:rPr>
-          <w:b/>
-          <w:bCs/>
-        </w:rPr>
-        <w:t xml:space="preserve">AUTORIZAÇÃO E APOIO PARA INTERDIÇÃO TEMPORÁRIA DE VIA E REALIZAÇÃO DE CARREATA</w:t>
-      </w:r>
-      <w:r>
-        <w:t xml:space="preserve">, com fundamento nos arts. 24 e 95 do Código de Trânsito Brasileiro, no art. 30, I, da Constituição Federal e nos arts. 89 e 114 do Código de Posturas do Município, pelos fatos e fundamentos a seguir.</w:t>
-      </w:r>
-    </w:p>
-    <w:p>
-      <w:pPr>
-        <w:keepNext/>
-        <w:shd w:fill="123BB8" w:color="auto" w:val="clear"/>
+        <w:t xml:space="preserve">, inscrito na OAB-PI sob o nº 21.320, constituído mediante procuração em anexo, com endereço físico na Rua Rio Grande do Sul, nº 1641, Bairro São Miguel, Miguel Alves-PI, CEP 64.130-000, e eletrônico paduanetojus@gmail.com, vem </w:t>
+      </w:r>
+      <w:r>
+        <w:rPr>
+          <w:b/>
+          <w:bCs/>
+        </w:rPr>
+        <w:t xml:space="preserve">REQUERER</w:t>
+      </w:r>
+      <w:r>
+        <w:t xml:space="preserve">, nos termos dos arts. 24 e 95 do Código de Trânsito Brasileiro, do art. 30, I, da Constituição Federal e dos arts. 89 e 114 do Código de Posturas do Município (Lei Municipal nº 592/1995), autorização e apoio para a interdição temporária de via e para a realização de carreata, em razão de evento público, gratuito e aberto à população, nos seguintes termos:</w:t>
+      </w:r>
+    </w:p>
+    <w:p>
+      <w:pPr>
         <w:tabs>
           <w:tab w:val="left" w:pos="1000"/>
         </w:tabs>
-        <w:spacing w:after="240" w:before="360" w:line="360"/>
-        <w:ind w:left="0"/>
-      </w:pPr>
-      <w:r>
-        <w:rPr>
-          <w:b/>
-          <w:bCs/>
-          <w:i/>
-          <w:iCs/>
-          <w:color w:val="FFFFFF"/>
-        </w:rPr>
-        <w:t xml:space="preserve">	I. Do evento.</w:t>
-      </w:r>
-    </w:p>
-    <w:p>
-      <w:pPr>
-        <w:spacing w:after="60" w:line="360"/>
-        <w:ind w:firstLine="850"/>
-        <w:jc w:val="both"/>
-      </w:pPr>
-      <w:r>
-        <w:t xml:space="preserve">O Requerente promoverá celebração popular, gratuita e aberta ao público, de caráter cívico-político, em comemoração à vitória do Presidente Luiz Inácio Lula da Silva no segundo turno das eleições presidenciais de 2026, com os seguintes dados:</w:t>
+        <w:spacing w:after="60" w:line="360"/>
+        <w:ind w:left="1000" w:hanging="400"/>
+        <w:jc w:val="both"/>
+      </w:pPr>
+      <w:r>
+        <w:t xml:space="preserve">a)	</w:t>
+      </w:r>
+      <w:r>
+        <w:rPr>
+          <w:b/>
+          <w:bCs/>
+        </w:rPr>
+        <w:t xml:space="preserve">Natureza:</w:t>
+      </w:r>
+      <w:r>
+        <w:t xml:space="preserve"> celebração popular pela vitória do Presidente Luiz Inácio Lula da Silva no segundo turno das eleições presidenciais de 2026;</w:t>
       </w:r>
     </w:p>
     <w:p>
@@ -134,7 +112,7 @@
         <w:jc w:val="both"/>
       </w:pPr>
       <w:r>
-        <w:t xml:space="preserve">a)	</w:t>
+        <w:t xml:space="preserve">b)	</w:t>
       </w:r>
       <w:r>
         <w:rPr>
@@ -157,7 +135,7 @@
         <w:jc w:val="both"/>
       </w:pPr>
       <w:r>
-        <w:t xml:space="preserve">b)	</w:t>
+        <w:t xml:space="preserve">c)	</w:t>
       </w:r>
       <w:r>
         <w:rPr>
@@ -178,7 +156,7 @@
         <w:t xml:space="preserve">[___]</w:t>
       </w:r>
       <w:r>
-        <w:t xml:space="preserve">, em frente ao Estádio Municipal Enéas Torres Filho (“O Torrão”), Miguel Alves-PI (Plus Code R493+M8);</w:t>
+        <w:t xml:space="preserve">, em frente ao Estádio Municipal Enéas Torres Filho (“O Torrão”), Miguel Alves-PI (Plus Code R493+M8), com palco na pista, som e apresentação de bandas;</w:t>
       </w:r>
     </w:p>
     <w:p>
@@ -191,17 +169,28 @@
         <w:jc w:val="both"/>
       </w:pPr>
       <w:r>
-        <w:t xml:space="preserve">c)	</w:t>
-      </w:r>
-      <w:r>
-        <w:rPr>
-          <w:b/>
-          <w:bCs/>
-        </w:rPr>
-        <w:t xml:space="preserve">Estrutura:</w:t>
-      </w:r>
-      <w:r>
-        <w:t xml:space="preserve"> palco provisório instalado na pista, em frente ao estádio, com som, iluminação e apresentação de bandas musicais;</w:t>
+        <w:t xml:space="preserve">d)	</w:t>
+      </w:r>
+      <w:r>
+        <w:rPr>
+          <w:b/>
+          <w:bCs/>
+        </w:rPr>
+        <w:t xml:space="preserve">Interdição requerida:</w:t>
+      </w:r>
+      <w:r>
+        <w:t xml:space="preserve"> Avenida Marcos Furtado, em frente ao estádio, das </w:t>
+      </w:r>
+      <w:r>
+        <w:rPr>
+          <w:b/>
+          <w:bCs/>
+          <w:shd w:fill="FFF200" w:color="auto" w:val="clear"/>
+        </w:rPr>
+        <w:t xml:space="preserve">[07h00]</w:t>
+      </w:r>
+      <w:r>
+        <w:t xml:space="preserve"> de 30/10/2026 até a retirada do palco, às 14h00 de 31/10/2026, abrangendo montagem, evento e desmontagem; subsidiariamente, interdição parcial, com corredor livre permanente para veículos de emergência;</w:t>
       </w:r>
     </w:p>
     <w:p>
@@ -214,7 +203,7 @@
         <w:jc w:val="both"/>
       </w:pPr>
       <w:r>
-        <w:t xml:space="preserve">d)	</w:t>
+        <w:t xml:space="preserve">e)	</w:t>
       </w:r>
       <w:r>
         <w:rPr>
@@ -224,7 +213,7 @@
         <w:t xml:space="preserve">Carreata:</w:t>
       </w:r>
       <w:r>
-        <w:t xml:space="preserve"> concentração às 16h00 em frente ao estádio, saída às 17h00, volta pelas vias públicas da cidade e retorno ao ponto de partida;</w:t>
+        <w:t xml:space="preserve"> concentração às 16h00 em frente ao Estádio Municipal Enéas Torres Filho, saída às 17h00, volta pelas vias públicas da cidade, com trajeto a ser ajustado com esta Secretaria e com a Polícia Militar, se necessário, e retorno ao ponto de partida, onde ocorrerão as apresentações artísticas;</w:t>
       </w:r>
     </w:p>
     <w:p>
@@ -237,17 +226,17 @@
         <w:jc w:val="both"/>
       </w:pPr>
       <w:r>
-        <w:t xml:space="preserve">e)	</w:t>
-      </w:r>
-      <w:r>
-        <w:rPr>
-          <w:b/>
-          <w:bCs/>
-        </w:rPr>
-        <w:t xml:space="preserve">Segurança:</w:t>
-      </w:r>
-      <w:r>
-        <w:t xml:space="preserve"> segurança privada contratada e policiamento ostensivo solicitado à Polícia Militar;</w:t>
+        <w:t xml:space="preserve">f)	</w:t>
+      </w:r>
+      <w:r>
+        <w:rPr>
+          <w:b/>
+          <w:bCs/>
+        </w:rPr>
+        <w:t xml:space="preserve">Público estimado:</w:t>
+      </w:r>
+      <w:r>
+        <w:t xml:space="preserve"> não há estimativa precisa, por se tratar de celebração aberta e de adesão espontânea, podendo superar 250 pessoas;</w:t>
       </w:r>
     </w:p>
     <w:p>
@@ -260,145 +249,40 @@
         <w:jc w:val="both"/>
       </w:pPr>
       <w:r>
-        <w:t xml:space="preserve">f)	</w:t>
-      </w:r>
-      <w:r>
-        <w:rPr>
-          <w:b/>
-          <w:bCs/>
-        </w:rPr>
-        <w:t xml:space="preserve">Interdição necessária:</w:t>
-      </w:r>
-      <w:r>
-        <w:t xml:space="preserve"> das </w:t>
-      </w:r>
-      <w:r>
-        <w:rPr>
-          <w:b/>
-          <w:bCs/>
-          <w:shd w:fill="FFF200" w:color="auto" w:val="clear"/>
-        </w:rPr>
-        <w:t xml:space="preserve">[07h00]</w:t>
-      </w:r>
-      <w:r>
-        <w:t xml:space="preserve"> de 30/10/2026 até a retirada do palco, às 14h00 de 31/10/2026, abrangendo a montagem do palco, o evento e a desmontagem.</w:t>
-      </w:r>
-    </w:p>
-    <w:p>
-      <w:pPr>
-        <w:spacing w:after="60" w:line="360"/>
-        <w:ind w:firstLine="850"/>
-        <w:jc w:val="both"/>
-      </w:pPr>
-      <w:r>
-        <w:t xml:space="preserve">A licença municipal para o evento (Decreto Municipal nº 87/2022 e Código de Posturas – Lei Municipal nº 592/1995) foi requerida à Prefeitura de Miguel Alves </w:t>
-      </w:r>
-      <w:r>
-        <w:rPr>
-          <w:b/>
-          <w:bCs/>
-          <w:shd w:fill="FFF200" w:color="auto" w:val="clear"/>
-        </w:rPr>
-        <w:t xml:space="preserve">[em __/10/2026, protocolo nº ____]</w:t>
-      </w:r>
-      <w:r>
-        <w:t xml:space="preserve">, e a comunicação prévia foi encaminhada à Polícia Militar.</w:t>
-      </w:r>
-    </w:p>
-    <w:p>
-      <w:pPr>
-        <w:keepNext/>
-        <w:shd w:fill="123BB8" w:color="auto" w:val="clear"/>
+        <w:t xml:space="preserve">g)	</w:t>
+      </w:r>
+      <w:r>
+        <w:rPr>
+          <w:b/>
+          <w:bCs/>
+        </w:rPr>
+        <w:t xml:space="preserve">Segurança:</w:t>
+      </w:r>
+      <w:r>
+        <w:t xml:space="preserve"> segurança privada contratada e policiamento ostensivo solicitado à Polícia Militar;</w:t>
+      </w:r>
+    </w:p>
+    <w:p>
+      <w:pPr>
         <w:tabs>
           <w:tab w:val="left" w:pos="1000"/>
         </w:tabs>
-        <w:spacing w:after="240" w:before="360" w:line="360"/>
-        <w:ind w:left="0"/>
-      </w:pPr>
-      <w:r>
-        <w:rPr>
-          <w:b/>
-          <w:bCs/>
-          <w:i/>
-          <w:iCs/>
-          <w:color w:val="FFFFFF"/>
-        </w:rPr>
-        <w:t xml:space="preserve">	II. Da competência do Município.</w:t>
-      </w:r>
-    </w:p>
-    <w:p>
-      <w:pPr>
-        <w:spacing w:after="60" w:line="360"/>
-        <w:ind w:firstLine="850"/>
-        <w:jc w:val="both"/>
-      </w:pPr>
-      <w:r>
-        <w:t xml:space="preserve">Nos termos do art. 95 do CTB, a interdição de via para evento depende de permissão prévia do órgão com circunscrição sobre ela:</w:t>
-      </w:r>
-    </w:p>
-    <w:p>
-      <w:pPr>
-        <w:pBdr>
-          <w:top w:val="single" w:color="9AA0A6" w:sz="4" w:space="6"/>
-          <w:bottom w:val="single" w:color="9AA0A6" w:sz="4" w:space="6"/>
-        </w:pBdr>
-        <w:spacing w:after="200" w:before="160" w:line="240"/>
-        <w:ind w:left="2270" w:right="570"/>
-        <w:jc w:val="both"/>
-      </w:pPr>
-      <w:r>
-        <w:rPr>
-          <w:i/>
-          <w:iCs/>
-          <w:sz w:val="18"/>
-          <w:szCs w:val="18"/>
-          <w:b/>
-          <w:bCs/>
-        </w:rPr>
-        <w:t xml:space="preserve">Art. 95.</w:t>
-      </w:r>
-      <w:r>
-        <w:rPr>
-          <w:i/>
-          <w:iCs/>
-          <w:sz w:val="18"/>
-          <w:szCs w:val="18"/>
-        </w:rPr>
-        <w:t xml:space="preserve"> </w:t>
-      </w:r>
-      <w:r>
-        <w:rPr>
-          <w:i/>
-          <w:iCs/>
-          <w:sz w:val="18"/>
-          <w:szCs w:val="18"/>
-          <w:b/>
-          <w:bCs/>
-          <w:u w:val="single"/>
-          <w:shd w:fill="CFE2F3" w:color="auto" w:val="clear"/>
-        </w:rPr>
-        <w:t xml:space="preserve">Nenhuma obra ou evento que possa perturbar ou interromper a livre circulação de veículos e pedestres, ou colocar em risco sua segurança, será iniciado sem permissão prévia do órgão ou entidade de trânsito com circunscrição sobre a via.</w:t>
-      </w:r>
-    </w:p>
-    <w:p>
-      <w:pPr>
-        <w:spacing w:after="60" w:line="360"/>
-        <w:ind w:firstLine="850"/>
-        <w:jc w:val="both"/>
-      </w:pPr>
-      <w:r>
-        <w:t xml:space="preserve">O trecho em frente ao estádio integra a rodovia estadual PI-</w:t>
-      </w:r>
-      <w:r>
-        <w:rPr>
-          <w:b/>
-          <w:bCs/>
-          <w:shd w:fill="FFF200" w:color="auto" w:val="clear"/>
-        </w:rPr>
-        <w:t xml:space="preserve">[___]</w:t>
-      </w:r>
-      <w:r>
-        <w:t xml:space="preserve">, razão pela qual a autorização para seu fechamento foi requerida também ao DER/PI (art. 21 do CTB). Ao Município, contudo, compete:</w:t>
+        <w:spacing w:after="60" w:line="360"/>
+        <w:ind w:left="1000" w:hanging="400"/>
+        <w:jc w:val="both"/>
+      </w:pPr>
+      <w:r>
+        <w:t xml:space="preserve">h)	</w:t>
+      </w:r>
+      <w:r>
+        <w:rPr>
+          <w:b/>
+          <w:bCs/>
+        </w:rPr>
+        <w:t xml:space="preserve">Sinalização e divulgação:</w:t>
+      </w:r>
+      <w:r>
+        <w:t xml:space="preserve"> a cargo do Requerente (art. 95, § 1º, do CTB), com sinalização vermelha de dia e luminosa à noite (art. 89, parágrafo único, do Código de Posturas) e ampla divulgação dos desvios à população;</w:t>
       </w:r>
     </w:p>
     <w:p>
@@ -414,86 +298,14 @@
         <w:t xml:space="preserve">i)	</w:t>
       </w:r>
       <w:r>
-        <w:t xml:space="preserve">autorizar a carreata nas </w:t>
-      </w:r>
-      <w:r>
-        <w:rPr>
-          <w:b/>
-          <w:bCs/>
-        </w:rPr>
-        <w:t xml:space="preserve">vias municipais</w:t>
-      </w:r>
-      <w:r>
-        <w:t xml:space="preserve"> do percurso, sobre as quais tem circunscrição (art. 24, II, do CTB);</w:t>
-      </w:r>
-    </w:p>
-    <w:p>
-      <w:pPr>
-        <w:tabs>
-          <w:tab w:val="left" w:pos="1000"/>
-        </w:tabs>
-        <w:spacing w:after="60" w:line="360"/>
-        <w:ind w:left="1000" w:hanging="400"/>
-        <w:jc w:val="both"/>
-      </w:pPr>
-      <w:r>
-        <w:t xml:space="preserve">ii)	</w:t>
-      </w:r>
-      <w:r>
-        <w:t xml:space="preserve">autorizar o uso do logradouro e a montagem do palco provisório, no exercício do poder de polícia sobre assuntos de interesse local (art. 30, I, da CF, e arts. 89 e 114 do Código de Posturas);</w:t>
-      </w:r>
-    </w:p>
-    <w:p>
-      <w:pPr>
-        <w:tabs>
-          <w:tab w:val="left" w:pos="1000"/>
-        </w:tabs>
-        <w:spacing w:after="60" w:line="360"/>
-        <w:ind w:left="1000" w:hanging="400"/>
-        <w:jc w:val="both"/>
-      </w:pPr>
-      <w:r>
-        <w:t xml:space="preserve">iii)	</w:t>
-      </w:r>
-      <w:r>
-        <w:t xml:space="preserve">operar o trânsito no trecho urbano da rodovia, caso haja convênio de delegação com o Estado (art. 25 do CTB);</w:t>
-      </w:r>
-    </w:p>
-    <w:p>
-      <w:pPr>
-        <w:tabs>
-          <w:tab w:val="left" w:pos="1000"/>
-        </w:tabs>
-        <w:spacing w:after="60" w:line="360"/>
-        <w:ind w:left="1000" w:hanging="400"/>
-        <w:jc w:val="both"/>
-      </w:pPr>
-      <w:r>
-        <w:t xml:space="preserve">iv)	</w:t>
-      </w:r>
-      <w:r>
-        <w:t xml:space="preserve">prestar o apoio operacional local – agentes, cones, cavaletes e orientação dos desvios – necessário à segurança do trânsito.</w:t>
-      </w:r>
-    </w:p>
-    <w:p>
-      <w:pPr>
-        <w:keepNext/>
-        <w:shd w:fill="123BB8" w:color="auto" w:val="clear"/>
-        <w:tabs>
-          <w:tab w:val="left" w:pos="1000"/>
-        </w:tabs>
-        <w:spacing w:after="240" w:before="360" w:line="360"/>
-        <w:ind w:left="0"/>
-      </w:pPr>
-      <w:r>
-        <w:rPr>
-          <w:b/>
-          <w:bCs/>
-          <w:i/>
-          <w:iCs/>
-          <w:color w:val="FFFFFF"/>
-        </w:rPr>
-        <w:t xml:space="preserve">	III. Da urgência.</w:t>
+        <w:rPr>
+          <w:b/>
+          <w:bCs/>
+        </w:rPr>
+        <w:t xml:space="preserve">Contato:</w:t>
+      </w:r>
+      <w:r>
+        <w:t xml:space="preserve"> (86) 9 7400-9869 (advogado) e paduanetojus@gmail.com.</w:t>
       </w:r>
     </w:p>
     <w:p>
@@ -503,179 +315,7 @@
         <w:jc w:val="both"/>
       </w:pPr>
       <w:r>
-        <w:t xml:space="preserve">O evento comemora resultado eleitoral conhecido apenas em 25/10/2026, o que impediu requerimento com maior antecedência. Considerando que o bloqueio se inicia na manhã de 30/10/2026, requer-se </w:t>
-      </w:r>
-      <w:r>
-        <w:rPr>
-          <w:b/>
-          <w:bCs/>
-        </w:rPr>
-        <w:t xml:space="preserve">decisão imediata</w:t>
-      </w:r>
-      <w:r>
-        <w:t xml:space="preserve">. O Requerente se compromete a divulgar amplamente a interdição e os desvios à população, pelos meios de comunicação locais, e a providenciar a sinalização do trecho (art. 95, § 1º, do CTB), com sinalização vermelha de dia e luminosa à noite.</w:t>
-      </w:r>
-    </w:p>
-    <w:p>
-      <w:pPr>
-        <w:keepNext/>
-        <w:shd w:fill="123BB8" w:color="auto" w:val="clear"/>
-        <w:tabs>
-          <w:tab w:val="left" w:pos="1000"/>
-        </w:tabs>
-        <w:spacing w:after="240" w:before="360" w:line="360"/>
-        <w:ind w:left="0"/>
-      </w:pPr>
-      <w:r>
-        <w:rPr>
-          <w:b/>
-          <w:bCs/>
-          <w:i/>
-          <w:iCs/>
-          <w:color w:val="FFFFFF"/>
-        </w:rPr>
-        <w:t xml:space="preserve">	IV. Dos pedidos.</w:t>
-      </w:r>
-    </w:p>
-    <w:p>
-      <w:pPr>
-        <w:spacing w:after="60" w:line="360"/>
-        <w:ind w:firstLine="850"/>
-        <w:jc w:val="both"/>
-      </w:pPr>
-      <w:r>
-        <w:t xml:space="preserve">Diante do exposto, requer:</w:t>
-      </w:r>
-    </w:p>
-    <w:p>
-      <w:pPr>
-        <w:tabs>
-          <w:tab w:val="left" w:pos="1000"/>
-        </w:tabs>
-        <w:spacing w:after="60" w:line="360"/>
-        <w:ind w:left="1000" w:hanging="400"/>
-        <w:jc w:val="both"/>
-      </w:pPr>
-      <w:r>
-        <w:t xml:space="preserve">a)	</w:t>
-      </w:r>
-      <w:r>
-        <w:t xml:space="preserve">a </w:t>
-      </w:r>
-      <w:r>
-        <w:rPr>
-          <w:b/>
-          <w:bCs/>
-        </w:rPr>
-        <w:t xml:space="preserve">autorização para interdição total</w:t>
-      </w:r>
-      <w:r>
-        <w:t xml:space="preserve"> da Avenida Marcos Furtado no trecho em frente ao Estádio Municipal Enéas Torres Filho, das </w:t>
-      </w:r>
-      <w:r>
-        <w:rPr>
-          <w:b/>
-          <w:bCs/>
-          <w:shd w:fill="FFF200" w:color="auto" w:val="clear"/>
-        </w:rPr>
-        <w:t xml:space="preserve">[07h00]</w:t>
-      </w:r>
-      <w:r>
-        <w:t xml:space="preserve"> de 30/10/2026 até a retirada do palco, às 14h00 de 31/10/2026, no que couber ao Município, ou, subsidiariamente, a </w:t>
-      </w:r>
-      <w:r>
-        <w:rPr>
-          <w:b/>
-          <w:bCs/>
-        </w:rPr>
-        <w:t xml:space="preserve">interdição parcial</w:t>
-      </w:r>
-      <w:r>
-        <w:t xml:space="preserve">, com corredor livre permanente para veículos de emergência;</w:t>
-      </w:r>
-    </w:p>
-    <w:p>
-      <w:pPr>
-        <w:tabs>
-          <w:tab w:val="left" w:pos="1000"/>
-        </w:tabs>
-        <w:spacing w:after="60" w:line="360"/>
-        <w:ind w:left="1000" w:hanging="400"/>
-        <w:jc w:val="both"/>
-      </w:pPr>
-      <w:r>
-        <w:t xml:space="preserve">b)	</w:t>
-      </w:r>
-      <w:r>
-        <w:t xml:space="preserve">a </w:t>
-      </w:r>
-      <w:r>
-        <w:rPr>
-          <w:b/>
-          <w:bCs/>
-        </w:rPr>
-        <w:t xml:space="preserve">autorização para a carreata</w:t>
-      </w:r>
-      <w:r>
-        <w:t xml:space="preserve"> nas vias municipais, com concentração às 16h00 e saída às 17h00 de 30/10/2026, observado o trajeto que vier a ser definido ou ajustado pelo órgão municipal e pela Polícia Militar;</w:t>
-      </w:r>
-    </w:p>
-    <w:p>
-      <w:pPr>
-        <w:tabs>
-          <w:tab w:val="left" w:pos="1000"/>
-        </w:tabs>
-        <w:spacing w:after="60" w:line="360"/>
-        <w:ind w:left="1000" w:hanging="400"/>
-        <w:jc w:val="both"/>
-      </w:pPr>
-      <w:r>
-        <w:t xml:space="preserve">c)	</w:t>
-      </w:r>
-      <w:r>
-        <w:t xml:space="preserve">o </w:t>
-      </w:r>
-      <w:r>
-        <w:rPr>
-          <w:b/>
-          <w:bCs/>
-        </w:rPr>
-        <w:t xml:space="preserve">apoio operacional</w:t>
-      </w:r>
-      <w:r>
-        <w:t xml:space="preserve"> de agentes municipais e de material de sinalização para o bloqueio e os desvios;</w:t>
-      </w:r>
-    </w:p>
-    <w:p>
-      <w:pPr>
-        <w:tabs>
-          <w:tab w:val="left" w:pos="1000"/>
-        </w:tabs>
-        <w:spacing w:after="60" w:line="360"/>
-        <w:ind w:left="1000" w:hanging="400"/>
-        <w:jc w:val="both"/>
-      </w:pPr>
-      <w:r>
-        <w:t xml:space="preserve">d)	</w:t>
-      </w:r>
-      <w:r>
-        <w:t xml:space="preserve">caso o Município opere o trânsito no trecho por convênio com o Estado, a autorização direta da interdição; caso contrário, a articulação imediata com o DER/PI;</w:t>
-      </w:r>
-    </w:p>
-    <w:p>
-      <w:pPr>
-        <w:tabs>
-          <w:tab w:val="left" w:pos="1000"/>
-        </w:tabs>
-        <w:spacing w:after="60" w:line="360"/>
-        <w:ind w:left="1000" w:hanging="400"/>
-        <w:jc w:val="both"/>
-      </w:pPr>
-      <w:r>
-        <w:t xml:space="preserve">e)	</w:t>
-      </w:r>
-      <w:r>
-        <w:t xml:space="preserve">a apreciação em </w:t>
+        <w:t xml:space="preserve">Por se tratar de trecho urbano de rodovia estadual, a autorização para o fechamento foi requerida também ao DER/PI (art. 21 do CTB). Solicita, assim, a autorização da carreata nas vias municipais e da interdição no que couber ao Município – inclusive diretamente, caso haja convênio de delegação com o Estado (art. 25 do CTB) –, o apoio de agentes e de material de sinalização para o bloqueio e os desvios, e a apreciação em </w:t>
       </w:r>
       <w:r>
         <w:rPr>
@@ -685,53 +325,11 @@
         <w:t xml:space="preserve">regime de urgência</w:t>
       </w:r>
       <w:r>
-        <w:t xml:space="preserve">, com decisão comunicada até a manhã de 30/10/2026;</w:t>
-      </w:r>
-    </w:p>
-    <w:p>
-      <w:pPr>
-        <w:tabs>
-          <w:tab w:val="left" w:pos="1000"/>
-        </w:tabs>
-        <w:spacing w:after="60" w:line="360"/>
-        <w:ind w:left="1000" w:hanging="400"/>
-        <w:jc w:val="both"/>
-      </w:pPr>
-      <w:r>
-        <w:t xml:space="preserve">f)	</w:t>
-      </w:r>
-      <w:r>
-        <w:t xml:space="preserve">que as comunicações sejam feitas ao advogado subscritor, pelo e-mail paduanetojus@gmail.com ou pelo telefone (86) 9 7400-9869.</w:t>
-      </w:r>
-    </w:p>
-    <w:p>
-      <w:pPr>
-        <w:spacing w:after="0"/>
-      </w:pPr>
-    </w:p>
-    <w:p>
-      <w:pPr>
-        <w:keepNext/>
-        <w:spacing w:after="0" w:line="360"/>
-        <w:jc w:val="center"/>
-      </w:pPr>
-      <w:r>
-        <w:t xml:space="preserve">Nestes termos,</w:t>
-      </w:r>
-    </w:p>
-    <w:p>
-      <w:pPr>
-        <w:keepNext/>
-        <w:spacing w:after="0" w:line="360"/>
-        <w:jc w:val="center"/>
-      </w:pPr>
-      <w:r>
-        <w:t xml:space="preserve">Pede deferimento.</w:t>
-      </w:r>
-    </w:p>
-    <w:p>
-      <w:pPr>
-        <w:keepNext/>
+        <w:t xml:space="preserve">, com decisão até a manhã de 30/10/2026, colocando-se à disposição para qualquer esclarecimento.</w:t>
+      </w:r>
+    </w:p>
+    <w:p>
+      <w:pPr>
         <w:spacing w:after="0"/>
       </w:pPr>
     </w:p>

</xml_diff>